<commit_message>
improved raport 1 and 2
</commit_message>
<xml_diff>
--- a/Rapoarte/TP-1.docx
+++ b/Rapoarte/TP-1.docx
@@ -286,15 +286,7 @@
           <w:szCs w:val="36"/>
           <w:rtl w:val="0"/>
         </w:rPr>
-        <w:t xml:space="preserve">”Linux and python introduction</w:t>
-      </w:r>
-      <w:r>
-        <w:rPr>
-          <w:sz w:val="36"/>
-          <w:szCs w:val="36"/>
-          <w:rtl w:val="0"/>
-        </w:rPr>
-        <w:t xml:space="preserve">”</w:t>
+        <w:t xml:space="preserve">”Linux and python introduction”</w:t>
       </w:r>
     </w:p>
     <w:p>
@@ -541,21 +533,7 @@
     </w:p>
     <w:p>
       <w:pPr>
-        <w:ind w:left="283" w:firstLine="0"/>
-        <w:rPr>
-          <w:sz w:val="32"/>
-          <w:szCs w:val="32"/>
-        </w:rPr>
-      </w:pPr>
-      <w:r>
-        <w:rPr>
-          <w:rtl w:val="0"/>
-        </w:rPr>
-      </w:r>
-    </w:p>
-    <w:p>
-      <w:pPr>
-        <w:ind w:left="283" w:firstLine="0"/>
+        <w:ind w:left="0" w:firstLine="0"/>
         <w:rPr>
           <w:sz w:val="32"/>
           <w:szCs w:val="32"/>
@@ -649,12 +627,12 @@
           <wp:inline distB="114300" distT="114300" distL="114300" distR="114300">
             <wp:extent cx="6692265" cy="2159000"/>
             <wp:effectExtent b="0" l="0" r="0" t="0"/>
-            <wp:docPr id="8" name="image1.png"/>
+            <wp:docPr id="7" name="image5.png"/>
             <a:graphic>
               <a:graphicData uri="http://schemas.openxmlformats.org/drawingml/2006/picture">
                 <pic:pic>
                   <pic:nvPicPr>
-                    <pic:cNvPr id="0" name="image1.png"/>
+                    <pic:cNvPr id="0" name="image5.png"/>
                     <pic:cNvPicPr preferRelativeResize="0"/>
                   </pic:nvPicPr>
                   <pic:blipFill>
@@ -748,12 +726,12 @@
           <wp:inline distB="114300" distT="114300" distL="114300" distR="114300">
             <wp:extent cx="4070332" cy="4190048"/>
             <wp:effectExtent b="0" l="0" r="0" t="0"/>
-            <wp:docPr id="24" name="image26.png"/>
+            <wp:docPr id="9" name="image4.png"/>
             <a:graphic>
               <a:graphicData uri="http://schemas.openxmlformats.org/drawingml/2006/picture">
                 <pic:pic>
                   <pic:nvPicPr>
-                    <pic:cNvPr id="0" name="image26.png"/>
+                    <pic:cNvPr id="0" name="image4.png"/>
                     <pic:cNvPicPr preferRelativeResize="0"/>
                   </pic:nvPicPr>
                   <pic:blipFill>
@@ -826,12 +804,12 @@
           <wp:inline distB="114300" distT="114300" distL="114300" distR="114300">
             <wp:extent cx="4534024" cy="3609023"/>
             <wp:effectExtent b="0" l="0" r="0" t="0"/>
-            <wp:docPr id="10" name="image3.png"/>
+            <wp:docPr id="8" name="image7.png"/>
             <a:graphic>
               <a:graphicData uri="http://schemas.openxmlformats.org/drawingml/2006/picture">
                 <pic:pic>
                   <pic:nvPicPr>
-                    <pic:cNvPr id="0" name="image3.png"/>
+                    <pic:cNvPr id="0" name="image7.png"/>
                     <pic:cNvPicPr preferRelativeResize="0"/>
                   </pic:nvPicPr>
                   <pic:blipFill>
@@ -922,27 +900,7 @@
           <w:szCs w:val="28"/>
           <w:rtl w:val="0"/>
         </w:rPr>
-        <w:t xml:space="preserve">C</w:t>
-      </w:r>
-      <w:r>
-        <w:rPr>
-          <w:b w:val="1"/>
-          <w:bCs w:val="1"/>
-          <w:sz w:val="28"/>
-          <w:szCs w:val="28"/>
-          <w:rtl w:val="0"/>
-        </w:rPr>
-        <w:t xml:space="preserve">odedex.io</w:t>
-      </w:r>
-      <w:r>
-        <w:rPr>
-          <w:b w:val="1"/>
-          <w:bCs w:val="1"/>
-          <w:sz w:val="28"/>
-          <w:szCs w:val="28"/>
-          <w:rtl w:val="0"/>
-        </w:rPr>
-        <w:t xml:space="preserve">:</w:t>
+        <w:t xml:space="preserve">Codedex.io:</w:t>
       </w:r>
     </w:p>
     <w:p>
@@ -966,12 +924,12 @@
           <wp:inline distB="114300" distT="114300" distL="114300" distR="114300">
             <wp:extent cx="6692265" cy="2514600"/>
             <wp:effectExtent b="0" l="0" r="0" t="0"/>
-            <wp:docPr id="16" name="image19.png"/>
+            <wp:docPr id="11" name="image14.png"/>
             <a:graphic>
               <a:graphicData uri="http://schemas.openxmlformats.org/drawingml/2006/picture">
                 <pic:pic>
                   <pic:nvPicPr>
-                    <pic:cNvPr id="0" name="image19.png"/>
+                    <pic:cNvPr id="0" name="image14.png"/>
                     <pic:cNvPicPr preferRelativeResize="0"/>
                   </pic:nvPicPr>
                   <pic:blipFill>
@@ -1129,12 +1087,12 @@
           <wp:inline distB="114300" distT="114300" distL="114300" distR="114300">
             <wp:extent cx="6692265" cy="3213100"/>
             <wp:effectExtent b="0" l="0" r="0" t="0"/>
-            <wp:docPr id="19" name="image17.png"/>
+            <wp:docPr id="10" name="image22.png"/>
             <a:graphic>
               <a:graphicData uri="http://schemas.openxmlformats.org/drawingml/2006/picture">
                 <pic:pic>
                   <pic:nvPicPr>
-                    <pic:cNvPr id="0" name="image17.png"/>
+                    <pic:cNvPr id="0" name="image22.png"/>
                     <pic:cNvPicPr preferRelativeResize="0"/>
                   </pic:nvPicPr>
                   <pic:blipFill>
@@ -1207,12 +1165,12 @@
           <wp:inline distB="114300" distT="114300" distL="114300" distR="114300">
             <wp:extent cx="6692265" cy="3213100"/>
             <wp:effectExtent b="0" l="0" r="0" t="0"/>
-            <wp:docPr id="4" name="image18.png"/>
+            <wp:docPr id="13" name="image2.png"/>
             <a:graphic>
               <a:graphicData uri="http://schemas.openxmlformats.org/drawingml/2006/picture">
                 <pic:pic>
                   <pic:nvPicPr>
-                    <pic:cNvPr id="0" name="image18.png"/>
+                    <pic:cNvPr id="0" name="image2.png"/>
                     <pic:cNvPicPr preferRelativeResize="0"/>
                   </pic:nvPicPr>
                   <pic:blipFill>
@@ -1285,12 +1243,12 @@
           <wp:inline distB="114300" distT="114300" distL="114300" distR="114300">
             <wp:extent cx="6692265" cy="3213100"/>
             <wp:effectExtent b="0" l="0" r="0" t="0"/>
-            <wp:docPr id="21" name="image21.png"/>
+            <wp:docPr id="12" name="image12.png"/>
             <a:graphic>
               <a:graphicData uri="http://schemas.openxmlformats.org/drawingml/2006/picture">
                 <pic:pic>
                   <pic:nvPicPr>
-                    <pic:cNvPr id="0" name="image21.png"/>
+                    <pic:cNvPr id="0" name="image12.png"/>
                     <pic:cNvPicPr preferRelativeResize="0"/>
                   </pic:nvPicPr>
                   <pic:blipFill>
@@ -1363,12 +1321,12 @@
           <wp:inline distB="114300" distT="114300" distL="114300" distR="114300">
             <wp:extent cx="6692265" cy="3213100"/>
             <wp:effectExtent b="0" l="0" r="0" t="0"/>
-            <wp:docPr id="9" name="image9.png"/>
+            <wp:docPr id="15" name="image10.png"/>
             <a:graphic>
               <a:graphicData uri="http://schemas.openxmlformats.org/drawingml/2006/picture">
                 <pic:pic>
                   <pic:nvPicPr>
-                    <pic:cNvPr id="0" name="image9.png"/>
+                    <pic:cNvPr id="0" name="image10.png"/>
                     <pic:cNvPicPr preferRelativeResize="0"/>
                   </pic:nvPicPr>
                   <pic:blipFill>
@@ -1441,12 +1399,12 @@
           <wp:inline distB="114300" distT="114300" distL="114300" distR="114300">
             <wp:extent cx="6692265" cy="3213100"/>
             <wp:effectExtent b="0" l="0" r="0" t="0"/>
-            <wp:docPr id="15" name="image10.png"/>
+            <wp:docPr id="14" name="image17.png"/>
             <a:graphic>
               <a:graphicData uri="http://schemas.openxmlformats.org/drawingml/2006/picture">
                 <pic:pic>
                   <pic:nvPicPr>
-                    <pic:cNvPr id="0" name="image10.png"/>
+                    <pic:cNvPr id="0" name="image17.png"/>
                     <pic:cNvPicPr preferRelativeResize="0"/>
                   </pic:nvPicPr>
                   <pic:blipFill>
@@ -1519,12 +1477,12 @@
           <wp:inline distB="114300" distT="114300" distL="114300" distR="114300">
             <wp:extent cx="6692265" cy="2590800"/>
             <wp:effectExtent b="0" l="0" r="0" t="0"/>
-            <wp:docPr id="23" name="image23.png"/>
+            <wp:docPr id="18" name="image1.png"/>
             <a:graphic>
               <a:graphicData uri="http://schemas.openxmlformats.org/drawingml/2006/picture">
                 <pic:pic>
                   <pic:nvPicPr>
-                    <pic:cNvPr id="0" name="image23.png"/>
+                    <pic:cNvPr id="0" name="image1.png"/>
                     <pic:cNvPicPr preferRelativeResize="0"/>
                   </pic:nvPicPr>
                   <pic:blipFill>
@@ -1597,12 +1555,12 @@
           <wp:inline distB="114300" distT="114300" distL="114300" distR="114300">
             <wp:extent cx="6692265" cy="2590800"/>
             <wp:effectExtent b="0" l="0" r="0" t="0"/>
-            <wp:docPr id="2" name="image12.png"/>
+            <wp:docPr id="16" name="image8.png"/>
             <a:graphic>
               <a:graphicData uri="http://schemas.openxmlformats.org/drawingml/2006/picture">
                 <pic:pic>
                   <pic:nvPicPr>
-                    <pic:cNvPr id="0" name="image12.png"/>
+                    <pic:cNvPr id="0" name="image8.png"/>
                     <pic:cNvPicPr preferRelativeResize="0"/>
                   </pic:nvPicPr>
                   <pic:blipFill>
@@ -1675,12 +1633,12 @@
           <wp:inline distB="114300" distT="114300" distL="114300" distR="114300">
             <wp:extent cx="6692265" cy="2590800"/>
             <wp:effectExtent b="0" l="0" r="0" t="0"/>
-            <wp:docPr id="22" name="image20.png"/>
+            <wp:docPr id="17" name="image26.png"/>
             <a:graphic>
               <a:graphicData uri="http://schemas.openxmlformats.org/drawingml/2006/picture">
                 <pic:pic>
                   <pic:nvPicPr>
-                    <pic:cNvPr id="0" name="image20.png"/>
+                    <pic:cNvPr id="0" name="image26.png"/>
                     <pic:cNvPicPr preferRelativeResize="0"/>
                   </pic:nvPicPr>
                   <pic:blipFill>
@@ -1753,12 +1711,12 @@
           <wp:inline distB="114300" distT="114300" distL="114300" distR="114300">
             <wp:extent cx="6692265" cy="2590800"/>
             <wp:effectExtent b="0" l="0" r="0" t="0"/>
-            <wp:docPr id="14" name="image16.png"/>
+            <wp:docPr id="19" name="image21.png"/>
             <a:graphic>
               <a:graphicData uri="http://schemas.openxmlformats.org/drawingml/2006/picture">
                 <pic:pic>
                   <pic:nvPicPr>
-                    <pic:cNvPr id="0" name="image16.png"/>
+                    <pic:cNvPr id="0" name="image21.png"/>
                     <pic:cNvPicPr preferRelativeResize="0"/>
                   </pic:nvPicPr>
                   <pic:blipFill>
@@ -1831,12 +1789,12 @@
           <wp:inline distB="114300" distT="114300" distL="114300" distR="114300">
             <wp:extent cx="6692265" cy="2590800"/>
             <wp:effectExtent b="0" l="0" r="0" t="0"/>
-            <wp:docPr id="26" name="image25.png"/>
+            <wp:docPr id="20" name="image3.png"/>
             <a:graphic>
               <a:graphicData uri="http://schemas.openxmlformats.org/drawingml/2006/picture">
                 <pic:pic>
                   <pic:nvPicPr>
-                    <pic:cNvPr id="0" name="image25.png"/>
+                    <pic:cNvPr id="0" name="image3.png"/>
                     <pic:cNvPicPr preferRelativeResize="0"/>
                   </pic:nvPicPr>
                   <pic:blipFill>
@@ -1909,12 +1867,12 @@
           <wp:inline distB="114300" distT="114300" distL="114300" distR="114300">
             <wp:extent cx="6692265" cy="2590800"/>
             <wp:effectExtent b="0" l="0" r="0" t="0"/>
-            <wp:docPr id="20" name="image14.png"/>
+            <wp:docPr id="21" name="image20.png"/>
             <a:graphic>
               <a:graphicData uri="http://schemas.openxmlformats.org/drawingml/2006/picture">
                 <pic:pic>
                   <pic:nvPicPr>
-                    <pic:cNvPr id="0" name="image14.png"/>
+                    <pic:cNvPr id="0" name="image20.png"/>
                     <pic:cNvPicPr preferRelativeResize="0"/>
                   </pic:nvPicPr>
                   <pic:blipFill>
@@ -1987,12 +1945,12 @@
           <wp:inline distB="114300" distT="114300" distL="114300" distR="114300">
             <wp:extent cx="6692265" cy="2590800"/>
             <wp:effectExtent b="0" l="0" r="0" t="0"/>
-            <wp:docPr id="3" name="image7.png"/>
+            <wp:docPr id="22" name="image25.png"/>
             <a:graphic>
               <a:graphicData uri="http://schemas.openxmlformats.org/drawingml/2006/picture">
                 <pic:pic>
                   <pic:nvPicPr>
-                    <pic:cNvPr id="0" name="image7.png"/>
+                    <pic:cNvPr id="0" name="image25.png"/>
                     <pic:cNvPicPr preferRelativeResize="0"/>
                   </pic:nvPicPr>
                   <pic:blipFill>
@@ -2065,12 +2023,12 @@
           <wp:inline distB="114300" distT="114300" distL="114300" distR="114300">
             <wp:extent cx="6692265" cy="2590800"/>
             <wp:effectExtent b="0" l="0" r="0" t="0"/>
-            <wp:docPr id="5" name="image11.png"/>
+            <wp:docPr id="23" name="image15.png"/>
             <a:graphic>
               <a:graphicData uri="http://schemas.openxmlformats.org/drawingml/2006/picture">
                 <pic:pic>
                   <pic:nvPicPr>
-                    <pic:cNvPr id="0" name="image11.png"/>
+                    <pic:cNvPr id="0" name="image15.png"/>
                     <pic:cNvPicPr preferRelativeResize="0"/>
                   </pic:nvPicPr>
                   <pic:blipFill>
@@ -2143,12 +2101,12 @@
           <wp:inline distB="114300" distT="114300" distL="114300" distR="114300">
             <wp:extent cx="6692265" cy="2590800"/>
             <wp:effectExtent b="0" l="0" r="0" t="0"/>
-            <wp:docPr id="11" name="image8.png"/>
+            <wp:docPr id="24" name="image24.png"/>
             <a:graphic>
               <a:graphicData uri="http://schemas.openxmlformats.org/drawingml/2006/picture">
                 <pic:pic>
                   <pic:nvPicPr>
-                    <pic:cNvPr id="0" name="image8.png"/>
+                    <pic:cNvPr id="0" name="image24.png"/>
                     <pic:cNvPicPr preferRelativeResize="0"/>
                   </pic:nvPicPr>
                   <pic:blipFill>
@@ -2221,12 +2179,12 @@
           <wp:inline distB="114300" distT="114300" distL="114300" distR="114300">
             <wp:extent cx="6692265" cy="2590800"/>
             <wp:effectExtent b="0" l="0" r="0" t="0"/>
-            <wp:docPr id="12" name="image15.png"/>
+            <wp:docPr id="25" name="image18.png"/>
             <a:graphic>
               <a:graphicData uri="http://schemas.openxmlformats.org/drawingml/2006/picture">
                 <pic:pic>
                   <pic:nvPicPr>
-                    <pic:cNvPr id="0" name="image15.png"/>
+                    <pic:cNvPr id="0" name="image18.png"/>
                     <pic:cNvPicPr preferRelativeResize="0"/>
                   </pic:nvPicPr>
                   <pic:blipFill>
@@ -2299,12 +2257,12 @@
           <wp:inline distB="114300" distT="114300" distL="114300" distR="114300">
             <wp:extent cx="6692265" cy="2590800"/>
             <wp:effectExtent b="0" l="0" r="0" t="0"/>
-            <wp:docPr id="1" name="image2.png"/>
+            <wp:docPr id="26" name="image19.png"/>
             <a:graphic>
               <a:graphicData uri="http://schemas.openxmlformats.org/drawingml/2006/picture">
                 <pic:pic>
                   <pic:nvPicPr>
-                    <pic:cNvPr id="0" name="image2.png"/>
+                    <pic:cNvPr id="0" name="image19.png"/>
                     <pic:cNvPicPr preferRelativeResize="0"/>
                   </pic:nvPicPr>
                   <pic:blipFill>
@@ -2377,12 +2335,12 @@
           <wp:inline distB="114300" distT="114300" distL="114300" distR="114300">
             <wp:extent cx="6692265" cy="2590800"/>
             <wp:effectExtent b="0" l="0" r="0" t="0"/>
-            <wp:docPr id="25" name="image24.png"/>
+            <wp:docPr id="1" name="image6.png"/>
             <a:graphic>
               <a:graphicData uri="http://schemas.openxmlformats.org/drawingml/2006/picture">
                 <pic:pic>
                   <pic:nvPicPr>
-                    <pic:cNvPr id="0" name="image24.png"/>
+                    <pic:cNvPr id="0" name="image6.png"/>
                     <pic:cNvPicPr preferRelativeResize="0"/>
                   </pic:nvPicPr>
                   <pic:blipFill>
@@ -2455,12 +2413,12 @@
           <wp:inline distB="114300" distT="114300" distL="114300" distR="114300">
             <wp:extent cx="6692265" cy="2590800"/>
             <wp:effectExtent b="0" l="0" r="0" t="0"/>
-            <wp:docPr id="17" name="image13.png"/>
+            <wp:docPr id="2" name="image16.png"/>
             <a:graphic>
               <a:graphicData uri="http://schemas.openxmlformats.org/drawingml/2006/picture">
                 <pic:pic>
                   <pic:nvPicPr>
-                    <pic:cNvPr id="0" name="image13.png"/>
+                    <pic:cNvPr id="0" name="image16.png"/>
                     <pic:cNvPicPr preferRelativeResize="0"/>
                   </pic:nvPicPr>
                   <pic:blipFill>
@@ -2533,12 +2491,12 @@
           <wp:inline distB="114300" distT="114300" distL="114300" distR="114300">
             <wp:extent cx="6692265" cy="3009900"/>
             <wp:effectExtent b="0" l="0" r="0" t="0"/>
-            <wp:docPr id="6" name="image22.png"/>
+            <wp:docPr id="3" name="image23.png"/>
             <a:graphic>
               <a:graphicData uri="http://schemas.openxmlformats.org/drawingml/2006/picture">
                 <pic:pic>
                   <pic:nvPicPr>
-                    <pic:cNvPr id="0" name="image22.png"/>
+                    <pic:cNvPr id="0" name="image23.png"/>
                     <pic:cNvPicPr preferRelativeResize="0"/>
                   </pic:nvPicPr>
                   <pic:blipFill>
@@ -2611,12 +2569,12 @@
           <wp:inline distB="114300" distT="114300" distL="114300" distR="114300">
             <wp:extent cx="6692265" cy="2921000"/>
             <wp:effectExtent b="0" l="0" r="0" t="0"/>
-            <wp:docPr id="18" name="image5.png"/>
+            <wp:docPr id="4" name="image13.png"/>
             <a:graphic>
               <a:graphicData uri="http://schemas.openxmlformats.org/drawingml/2006/picture">
                 <pic:pic>
                   <pic:nvPicPr>
-                    <pic:cNvPr id="0" name="image5.png"/>
+                    <pic:cNvPr id="0" name="image13.png"/>
                     <pic:cNvPicPr preferRelativeResize="0"/>
                   </pic:nvPicPr>
                   <pic:blipFill>
@@ -2689,12 +2647,12 @@
           <wp:inline distB="114300" distT="114300" distL="114300" distR="114300">
             <wp:extent cx="6692265" cy="2921000"/>
             <wp:effectExtent b="0" l="0" r="0" t="0"/>
-            <wp:docPr id="13" name="image4.png"/>
+            <wp:docPr id="5" name="image9.png"/>
             <a:graphic>
               <a:graphicData uri="http://schemas.openxmlformats.org/drawingml/2006/picture">
                 <pic:pic>
                   <pic:nvPicPr>
-                    <pic:cNvPr id="0" name="image4.png"/>
+                    <pic:cNvPr id="0" name="image9.png"/>
                     <pic:cNvPicPr preferRelativeResize="0"/>
                   </pic:nvPicPr>
                   <pic:blipFill>
@@ -2785,12 +2743,12 @@
           <wp:inline distB="114300" distT="114300" distL="114300" distR="114300">
             <wp:extent cx="6692265" cy="2921000"/>
             <wp:effectExtent b="0" l="0" r="0" t="0"/>
-            <wp:docPr id="7" name="image6.png"/>
+            <wp:docPr id="6" name="image11.png"/>
             <a:graphic>
               <a:graphicData uri="http://schemas.openxmlformats.org/drawingml/2006/picture">
                 <pic:pic>
                   <pic:nvPicPr>
-                    <pic:cNvPr id="0" name="image6.png"/>
+                    <pic:cNvPr id="0" name="image11.png"/>
                     <pic:cNvPicPr preferRelativeResize="0"/>
                   </pic:nvPicPr>
                   <pic:blipFill>
@@ -3170,7 +3128,6 @@
     <w:pPr>
       <w:keepNext w:val="0"/>
       <w:keepLines w:val="0"/>
-      <w:pageBreakBefore w:val="0"/>
       <w:widowControl w:val="1"/>
       <w:pBdr>
         <w:top w:space="0" w:sz="0" w:val="nil"/>
@@ -3234,7 +3191,6 @@
     <w:pPr>
       <w:keepNext w:val="0"/>
       <w:keepLines w:val="0"/>
-      <w:pageBreakBefore w:val="0"/>
       <w:widowControl w:val="1"/>
       <w:pBdr>
         <w:top w:space="0" w:sz="0" w:val="nil"/>
@@ -3282,7 +3238,6 @@
     <w:pPr>
       <w:keepNext w:val="0"/>
       <w:keepLines w:val="0"/>
-      <w:pageBreakBefore w:val="0"/>
       <w:widowControl w:val="1"/>
       <w:pBdr>
         <w:top w:space="0" w:sz="0" w:val="nil"/>
@@ -3346,7 +3301,6 @@
     <w:pPr>
       <w:keepNext w:val="0"/>
       <w:keepLines w:val="0"/>
-      <w:pageBreakBefore w:val="0"/>
       <w:widowControl w:val="1"/>
       <w:pBdr>
         <w:top w:space="0" w:sz="0" w:val="nil"/>

</xml_diff>